<commit_message>
Fixed issue with alignment
</commit_message>
<xml_diff>
--- a/lib/templates/pandoc_reference.docx
+++ b/lib/templates/pandoc_reference.docx
@@ -944,7 +944,7 @@
     <w:name w:val="Normal"/>
     <w:qFormat/>
     <w:pPr>
-      <w:spacing w:before="40" w:after="80"/>
+      <w:spacing w:before="40"/>
     </w:pPr>
   </w:style>
   <w:style w:type="paragraph" w:styleId="Heading1">
@@ -1073,7 +1073,7 @@
     <w:pPr>
       <w:keepNext/>
       <w:keepLines/>
-      <w:spacing w:before="40" w:after="0"/>
+      <w:spacing w:after="0"/>
       <w:outlineLvl w:val="5"/>
     </w:pPr>
     <w:rPr>
@@ -1096,7 +1096,7 @@
     <w:pPr>
       <w:keepNext/>
       <w:keepLines/>
-      <w:spacing w:before="40" w:after="0"/>
+      <w:spacing w:after="0"/>
       <w:outlineLvl w:val="6"/>
     </w:pPr>
     <w:rPr>
@@ -1180,12 +1180,8 @@
     <w:basedOn w:val="Normal"/>
     <w:qFormat/>
     <w:rsid w:val="00A536B9"/>
-    <w:pPr>
-      <w:spacing w:before="40" w:after="80"/>
-    </w:pPr>
     <w:rPr>
       <w:rFonts w:ascii="Arial" w:hAnsi="Arial"/>
-      <w:sz w:val="22"/>
     </w:rPr>
   </w:style>
   <w:style w:type="paragraph" w:customStyle="1" w:styleId="FirstParagraph">
@@ -1214,7 +1210,6 @@
     <w:qFormat/>
     <w:rsid w:val="00A10FD9"/>
     <w:pPr>
-      <w:spacing w:after="80"/>
       <w:contextualSpacing/>
       <w:jc w:val="center"/>
     </w:pPr>
@@ -1606,6 +1601,33 @@
       <w:rFonts w:asciiTheme="majorHAnsi" w:hAnsiTheme="majorHAnsi"/>
       <w:color w:val="0F4761" w:themeColor="accent1" w:themeShade="BF"/>
     </w:rPr>
+  </w:style>
+  <w:style w:type="paragraph" w:customStyle="1" w:styleId="AlignCenter">
+    <w:name w:val="AlignCenter"/>
+    <w:basedOn w:val="Normal"/>
+    <w:next w:val="Normal"/>
+    <w:qFormat/>
+    <w:rsid w:val="00514BC8"/>
+    <w:pPr>
+      <w:jc w:val="center"/>
+    </w:pPr>
+  </w:style>
+  <w:style w:type="paragraph" w:customStyle="1" w:styleId="AlignRight">
+    <w:name w:val="AlignRight"/>
+    <w:basedOn w:val="Normal"/>
+    <w:next w:val="Normal"/>
+    <w:qFormat/>
+    <w:rsid w:val="00514BC8"/>
+    <w:pPr>
+      <w:jc w:val="right"/>
+    </w:pPr>
+  </w:style>
+  <w:style w:type="paragraph" w:customStyle="1" w:styleId="AlignJustify">
+    <w:name w:val="AlignJustify"/>
+    <w:basedOn w:val="Normal"/>
+    <w:next w:val="Normal"/>
+    <w:qFormat/>
+    <w:rsid w:val="00514BC8"/>
   </w:style>
 </w:styles>
 </file>

</xml_diff>